<commit_message>
Version 2.1.0: changelog, updated user guide, Origin check without importing it
- Version 2.1.0 (app and installer); CHANGELOG.md
- User guide: version, the GCD/KK/fit descriptions that changed, and a
  What's-new section
- 'Send to Origin' availability is checked with importlib.util.find_spec rather
  than importing originpro, which loads Origin's native extension even on
  machines without Origin

Co-Authored-By: Claude Opus 5.5 <noreply@anthropic.com>
Claude-Session: https://claude.ai/code/session_01AVPCuM1vrgCwJ6Z7LiJ62s
</commit_message>
<xml_diff>
--- a/Supercap_Suite_User_Guide.docx
+++ b/Supercap_Suite_User_Guide.docx
@@ -71,7 +71,7 @@
           <w:b/>
           <w:sz w:val="26"/>
         </w:rPr>
-        <w:t>User guide  ·  version 2.0.0</w:t>
+        <w:t>User guide  ·  version 2.1.0</w:t>
       </w:r>
     </w:p>
     <w:p/>
@@ -807,7 +807,7 @@
           <w:rFonts w:ascii="Consolas" w:hAnsi="Consolas"/>
           <w:sz w:val="19"/>
         </w:rPr>
-        <w:t>dist\SupercapSuite-2.0.0-portable.zip</w:t>
+        <w:t>dist\SupercapSuite-2.1.0-portable.zip</w:t>
       </w:r>
       <w:r>
         <w:t xml:space="preserve"> anywhere and run </w:t>
@@ -1869,7 +1869,7 @@
         <w:t>▶ Analyze discharge segment</w:t>
       </w:r>
       <w:r>
-        <w:t xml:space="preserve"> — capacitance, ESR, energy and power density, with the method and R² always shown.</w:t>
+        <w:t xml:space="preserve"> — capacitance, ESR, energy and power density, with the method and R² always shown. The IR drop is excluded from ΔV by default, ESR uses ΔV_IR / 2I when the discharge follows charging directly, and energy and power are not given for a three-electrode measurement.</w:t>
       </w:r>
     </w:p>
     <w:p>
@@ -2495,7 +2495,7 @@
         <w:t>▶ Run Kramers-Kronig validity test</w:t>
       </w:r>
       <w:r>
-        <w:t xml:space="preserve"> checks the data is self-consistent before fitting.</w:t>
+        <w:t xml:space="preserve"> checks the data is self-consistent before fitting. It also warns when the residuals follow a smooth trend with frequency (drift during the sweep), even if they pass.</w:t>
       </w:r>
     </w:p>
     <w:p>
@@ -2633,7 +2633,7 @@
         <w:t>⬇ Export circuit diagram as image…</w:t>
       </w:r>
       <w:r>
-        <w:t>) and parameters with fit quality are listed.</w:t>
+        <w:t>) and parameters are listed with the fit quality as an RMS residual in % of |Z|. Auto-detect ranks circuits by AICc, so a more complex circuit has to earn its extra parameters.</w:t>
       </w:r>
     </w:p>
     <w:p>
@@ -3955,8 +3955,138 @@
         <w:t>Figure 8. The About page.</w:t>
       </w:r>
     </w:p>
+    <w:p>
+      <w:pPr>
+        <w:pStyle w:val="Heading1"/>
+      </w:pPr>
+      <w:r>
+        <w:t>What's new in version 2.1.0</w:t>
+      </w:r>
+    </w:p>
+    <w:p>
+      <w:r>
+        <w:t>Changes after independent science, code and usability reviews; docs/REVIEW_LOG.md lists every finding and what was done.</w:t>
+      </w:r>
+    </w:p>
+    <w:p>
+      <w:pPr>
+        <w:pStyle w:val="ListBullet"/>
+      </w:pPr>
+      <w:r>
+        <w:rPr>
+          <w:b/>
+        </w:rPr>
+        <w:t>GCD</w:t>
+      </w:r>
+      <w:r>
+        <w:t xml:space="preserve"> — the integral formula now measures V from the end-of-discharge voltage, so it agrees with the linear formula for any window; the IR drop is excluded from ΔV and Δt.</w:t>
+      </w:r>
+    </w:p>
+    <w:p>
+      <w:pPr>
+        <w:pStyle w:val="ListBullet"/>
+      </w:pPr>
+      <w:r>
+        <w:rPr>
+          <w:b/>
+        </w:rPr>
+        <w:t>Cycling</w:t>
+      </w:r>
+      <w:r>
+        <w:t xml:space="preserve"> — coulombic efficiency is computed from charge (Q) when the file has a current column; retention can be relative to the mean of the first N cycles.</w:t>
+      </w:r>
+    </w:p>
+    <w:p>
+      <w:pPr>
+        <w:pStyle w:val="ListBullet"/>
+      </w:pPr>
+      <w:r>
+        <w:rPr>
+          <w:b/>
+        </w:rPr>
+        <w:t>CV</w:t>
+      </w:r>
+      <w:r>
+        <w:t xml:space="preserve"> — a warning appears when the selected rows contain more than one cycle (their charge would add up).</w:t>
+      </w:r>
+    </w:p>
+    <w:p>
+      <w:pPr>
+        <w:pStyle w:val="ListBullet"/>
+      </w:pPr>
+      <w:r>
+        <w:rPr>
+          <w:b/>
+        </w:rPr>
+        <w:t>EIS fitting</w:t>
+      </w:r>
+      <w:r>
+        <w:t xml:space="preserve"> — points are weighted by their relative error, the classic Randles circuit Rs + Cdl‖(Rct+W) was added, capacitances above 10 F are allowed, and interchangeable stages are reported fastest first.</w:t>
+      </w:r>
+    </w:p>
+    <w:p>
+      <w:pPr>
+        <w:pStyle w:val="ListBullet"/>
+      </w:pPr>
+      <w:r>
+        <w:rPr>
+          <w:b/>
+        </w:rPr>
+        <w:t>Kramers–Kronig</w:t>
+      </w:r>
+      <w:r>
+        <w:t xml:space="preserve"> — a series capacitor and inductor are included, so a valid supercapacitor spectrum with its capacitive tail passes; smooth drift is flagged.</w:t>
+      </w:r>
+    </w:p>
+    <w:p>
+      <w:pPr>
+        <w:pStyle w:val="ListBullet"/>
+      </w:pPr>
+      <w:r>
+        <w:rPr>
+          <w:b/>
+        </w:rPr>
+        <w:t>DRT</w:t>
+      </w:r>
+      <w:r>
+        <w:t xml:space="preserve"> — λ can be chosen from the data by real/imaginary cross-validation.</w:t>
+      </w:r>
+    </w:p>
+    <w:p>
+      <w:pPr>
+        <w:pStyle w:val="ListBullet"/>
+      </w:pPr>
+      <w:r>
+        <w:rPr>
+          <w:b/>
+        </w:rPr>
+        <w:t>DSC</w:t>
+      </w:r>
+      <w:r>
+        <w:t xml:space="preserve"> — the heat-flow unit is read from the header (W, mW, µW, W/g, mW/mg); overlapping peaks in one window are reported separately; graphs use temperature when the X axis is temperature.</w:t>
+      </w:r>
+    </w:p>
+    <w:p>
+      <w:pPr>
+        <w:pStyle w:val="ListBullet"/>
+      </w:pPr>
+      <w:r>
+        <w:rPr>
+          <w:b/>
+        </w:rPr>
+        <w:t>Reliability</w:t>
+      </w:r>
+      <w:r>
+        <w:t xml:space="preserve"> — loading a file clears the previous result; a fit still running on old data is discarded; closing the window during a fit no longer crashes.</w:t>
+      </w:r>
+    </w:p>
     <w:sectPr>
       <w:footerReference w:type="default" r:id="rId18"/>
+      <w:headerReference w:type="default" r:id="rId19"/>
+      <w:headerReference w:type="first" r:id="rId20"/>
+      <w:footerReference w:type="first" r:id="rId21"/>
+      <w:headerReference w:type="even" r:id="rId22"/>
+      <w:footerReference w:type="even" r:id="rId23"/>
       <w:pgSz w:w="12240" w:h="15840"/>
       <w:pgMar w:top="1134" w:right="1247" w:bottom="1020" w:left="1247" w:header="720" w:footer="720" w:gutter="0"/>
       <w:cols w:space="720"/>
@@ -3978,7 +4108,7 @@
         <w:color w:val="6A7280"/>
         <w:sz w:val="17"/>
       </w:rPr>
-      <w:t xml:space="preserve">Supercapacitor &amp; DSC Analysis Suite 2.0.0 — user guide   ·   page </w:t>
+      <w:t xml:space="preserve">Supercapacitor &amp; DSC Analysis Suite 2.1.0 — user guide   ·   page </w:t>
     </w:r>
     <w:r>
       <w:rPr>
@@ -4003,6 +4133,56 @@
     </w:r>
   </w:p>
 </w:ftr>
+</file>
+
+<file path=word/footer2.xml><?xml version="1.0" encoding="utf-8"?>
+<w:ftr xmlns:m="http://schemas.openxmlformats.org/officeDocument/2006/math" xmlns:mc="http://schemas.openxmlformats.org/markup-compatibility/2006" xmlns:mo="http://schemas.microsoft.com/office/mac/office/2008/main" xmlns:mv="urn:schemas-microsoft-com:mac:vml" xmlns:o="urn:schemas-microsoft-com:office:office" xmlns:r="http://schemas.openxmlformats.org/officeDocument/2006/relationships" xmlns:v="urn:schemas-microsoft-com:vml" xmlns:w10="urn:schemas-microsoft-com:office:word" xmlns:w14="http://schemas.microsoft.com/office/word/2010/wordml" xmlns:w="http://schemas.openxmlformats.org/wordprocessingml/2006/main" xmlns:wne="http://schemas.microsoft.com/office/word/2006/wordml" xmlns:wp14="http://schemas.microsoft.com/office/word/2010/wordprocessingDrawing" xmlns:wp="http://schemas.openxmlformats.org/drawingml/2006/wordprocessingDrawing" xmlns:wpc="http://schemas.microsoft.com/office/word/2010/wordprocessingCanvas" xmlns:wpg="http://schemas.microsoft.com/office/word/2010/wordprocessingGroup" xmlns:wpi="http://schemas.microsoft.com/office/word/2010/wordprocessingInk" xmlns:wps="http://schemas.microsoft.com/office/word/2010/wordprocessingShape" mc:Ignorable="w14 wp14">
+  <w:p>
+    <w:pPr>
+      <w:pStyle w:val="Footer"/>
+    </w:pPr>
+  </w:p>
+</w:ftr>
+</file>
+
+<file path=word/footer3.xml><?xml version="1.0" encoding="utf-8"?>
+<w:ftr xmlns:m="http://schemas.openxmlformats.org/officeDocument/2006/math" xmlns:mc="http://schemas.openxmlformats.org/markup-compatibility/2006" xmlns:mo="http://schemas.microsoft.com/office/mac/office/2008/main" xmlns:mv="urn:schemas-microsoft-com:mac:vml" xmlns:o="urn:schemas-microsoft-com:office:office" xmlns:r="http://schemas.openxmlformats.org/officeDocument/2006/relationships" xmlns:v="urn:schemas-microsoft-com:vml" xmlns:w10="urn:schemas-microsoft-com:office:word" xmlns:w14="http://schemas.microsoft.com/office/word/2010/wordml" xmlns:w="http://schemas.openxmlformats.org/wordprocessingml/2006/main" xmlns:wne="http://schemas.microsoft.com/office/word/2006/wordml" xmlns:wp14="http://schemas.microsoft.com/office/word/2010/wordprocessingDrawing" xmlns:wp="http://schemas.openxmlformats.org/drawingml/2006/wordprocessingDrawing" xmlns:wpc="http://schemas.microsoft.com/office/word/2010/wordprocessingCanvas" xmlns:wpg="http://schemas.microsoft.com/office/word/2010/wordprocessingGroup" xmlns:wpi="http://schemas.microsoft.com/office/word/2010/wordprocessingInk" xmlns:wps="http://schemas.microsoft.com/office/word/2010/wordprocessingShape" mc:Ignorable="w14 wp14">
+  <w:p>
+    <w:pPr>
+      <w:pStyle w:val="Footer"/>
+    </w:pPr>
+  </w:p>
+</w:ftr>
+</file>
+
+<file path=word/header1.xml><?xml version="1.0" encoding="utf-8"?>
+<w:hdr xmlns:m="http://schemas.openxmlformats.org/officeDocument/2006/math" xmlns:mc="http://schemas.openxmlformats.org/markup-compatibility/2006" xmlns:mo="http://schemas.microsoft.com/office/mac/office/2008/main" xmlns:mv="urn:schemas-microsoft-com:mac:vml" xmlns:o="urn:schemas-microsoft-com:office:office" xmlns:r="http://schemas.openxmlformats.org/officeDocument/2006/relationships" xmlns:v="urn:schemas-microsoft-com:vml" xmlns:w10="urn:schemas-microsoft-com:office:word" xmlns:w14="http://schemas.microsoft.com/office/word/2010/wordml" xmlns:w="http://schemas.openxmlformats.org/wordprocessingml/2006/main" xmlns:wne="http://schemas.microsoft.com/office/word/2006/wordml" xmlns:wp14="http://schemas.microsoft.com/office/word/2010/wordprocessingDrawing" xmlns:wp="http://schemas.openxmlformats.org/drawingml/2006/wordprocessingDrawing" xmlns:wpc="http://schemas.microsoft.com/office/word/2010/wordprocessingCanvas" xmlns:wpg="http://schemas.microsoft.com/office/word/2010/wordprocessingGroup" xmlns:wpi="http://schemas.microsoft.com/office/word/2010/wordprocessingInk" xmlns:wps="http://schemas.microsoft.com/office/word/2010/wordprocessingShape" mc:Ignorable="w14 wp14">
+  <w:p>
+    <w:pPr>
+      <w:pStyle w:val="Header"/>
+    </w:pPr>
+  </w:p>
+</w:hdr>
+</file>
+
+<file path=word/header2.xml><?xml version="1.0" encoding="utf-8"?>
+<w:hdr xmlns:m="http://schemas.openxmlformats.org/officeDocument/2006/math" xmlns:mc="http://schemas.openxmlformats.org/markup-compatibility/2006" xmlns:mo="http://schemas.microsoft.com/office/mac/office/2008/main" xmlns:mv="urn:schemas-microsoft-com:mac:vml" xmlns:o="urn:schemas-microsoft-com:office:office" xmlns:r="http://schemas.openxmlformats.org/officeDocument/2006/relationships" xmlns:v="urn:schemas-microsoft-com:vml" xmlns:w10="urn:schemas-microsoft-com:office:word" xmlns:w14="http://schemas.microsoft.com/office/word/2010/wordml" xmlns:w="http://schemas.openxmlformats.org/wordprocessingml/2006/main" xmlns:wne="http://schemas.microsoft.com/office/word/2006/wordml" xmlns:wp14="http://schemas.microsoft.com/office/word/2010/wordprocessingDrawing" xmlns:wp="http://schemas.openxmlformats.org/drawingml/2006/wordprocessingDrawing" xmlns:wpc="http://schemas.microsoft.com/office/word/2010/wordprocessingCanvas" xmlns:wpg="http://schemas.microsoft.com/office/word/2010/wordprocessingGroup" xmlns:wpi="http://schemas.microsoft.com/office/word/2010/wordprocessingInk" xmlns:wps="http://schemas.microsoft.com/office/word/2010/wordprocessingShape" mc:Ignorable="w14 wp14">
+  <w:p>
+    <w:pPr>
+      <w:pStyle w:val="Header"/>
+    </w:pPr>
+  </w:p>
+</w:hdr>
+</file>
+
+<file path=word/header3.xml><?xml version="1.0" encoding="utf-8"?>
+<w:hdr xmlns:m="http://schemas.openxmlformats.org/officeDocument/2006/math" xmlns:mc="http://schemas.openxmlformats.org/markup-compatibility/2006" xmlns:mo="http://schemas.microsoft.com/office/mac/office/2008/main" xmlns:mv="urn:schemas-microsoft-com:mac:vml" xmlns:o="urn:schemas-microsoft-com:office:office" xmlns:r="http://schemas.openxmlformats.org/officeDocument/2006/relationships" xmlns:v="urn:schemas-microsoft-com:vml" xmlns:w10="urn:schemas-microsoft-com:office:word" xmlns:w14="http://schemas.microsoft.com/office/word/2010/wordml" xmlns:w="http://schemas.openxmlformats.org/wordprocessingml/2006/main" xmlns:wne="http://schemas.microsoft.com/office/word/2006/wordml" xmlns:wp14="http://schemas.microsoft.com/office/word/2010/wordprocessingDrawing" xmlns:wp="http://schemas.openxmlformats.org/drawingml/2006/wordprocessingDrawing" xmlns:wpc="http://schemas.microsoft.com/office/word/2010/wordprocessingCanvas" xmlns:wpg="http://schemas.microsoft.com/office/word/2010/wordprocessingGroup" xmlns:wpi="http://schemas.microsoft.com/office/word/2010/wordprocessingInk" xmlns:wps="http://schemas.microsoft.com/office/word/2010/wordprocessingShape" mc:Ignorable="w14 wp14">
+  <w:p>
+    <w:pPr>
+      <w:pStyle w:val="Header"/>
+    </w:pPr>
+  </w:p>
+</w:hdr>
 </file>
 
 <file path=word/numbering.xml><?xml version="1.0" encoding="utf-8"?>

</xml_diff>